<commit_message>
figures: redraw Fig 1 and Fig 2 in ICRA/T-RO hero style
Modeled on the Cai et al. ICRA 2025 architecture figure conventions:
- shaded phase regions (LEARNED/VERIFIED/ACTUATION; PHASE 1/PHASE 2)
- thick color-coded flow arrows with white-haloed labels
- neuron-circle network drawings for encoder and residual head
- cartoon AUV icon, frozen/trained tags, param counts on both cards
- panel b safety ladder with connector arrows and outcome card
- standalone build script paper/build_hero_figures.py
- CN manuscript renamed to canonical PAC_manuscript_draft_CN_v2.docx
</commit_message>
<xml_diff>
--- a/paper/PAC_manuscript_draft_v2.docx
+++ b/paper/PAC_manuscript_draft_v2.docx
@@ -94,7 +94,7 @@
           <w:color w:val="000000"/>
           <w:sz w:val="22"/>
         </w:rPr>
-        <w:t>Classical underwater controllers fail in complementary ways: sliding-mode control (SMC) is robust but coarse, and constrained model predictive control (MPC) is precise but collapses under actuator degradation, where our simulation shows a tracking error of 0.822 m, nine times the nominal level. Predictive authority control (PAC) does not replace these controllers; a compact temporal encoder predicts a bounded authority coefficient that convexly blends their commands, so no thruster command is ever produced by the network. We extend the supervised policy (PAC-S) with a constrained residual stage (PAC-RL): the supervisor is frozen, and a zero-initialized 2,177-parameter head outputs a correction bounded by 0.1, so the deployed system is numerically identical to the baseline at initialization. In a paired, registered evaluation of 1,680 simulation rollouts over in-distribution and out-of-distribution disturbance families, PAC-RL reduces out-of-distribution tracking RMSE by 28% (0.161 m to 0.116 m; 95% CI [−0.074, −0.015] m), confines the degradation failure to 0.090 m, and pays a measured price: in-distribution error +0.4%, heading error +4.3%, and a solver deadline-miss increase. A constant blend α = 0.5 comes within 3% overall, so the residual's value is concentrated where adaptation is hardest, not in the average. Of the six registered criteria concerning the residual stage, three pass, two fail, and one is unevaluated; all are reported.</w:t>
+        <w:t>Classical underwater controllers fail in complementary ways: sliding-mode control (SMC) is robust but coarse, and constrained model predictive control (MPC) is precise but collapses under actuator degradation, where our simulation shows a tracking error of 0.822 m, nine times the nominal level. Predictive authority control (PAC) does not replace these controllers; a compact temporal encoder predicts a bounded authority coefficient that convexly blends their commands, so no thruster command is ever produced by the network. We extend the supervised PAC policy with a constrained residual stage: the supervisor is frozen, and a zero-initialized 2,177-parameter head outputs a correction bounded by 0.1, so the deployed system is numerically identical to the baseline at initialization. In a paired, registered evaluation of 1,680 simulation rollouts over in-distribution and out-of-distribution disturbance families, The residual policy reduces out-of-distribution tracking RMSE by 28% (0.161 m to 0.116 m; 95% CI [−0.074, −0.015] m), confines the degradation failure to 0.090 m, and pays a measured price: in-distribution error +0.4%, heading error +4.3%, and a solver deadline-miss increase. A constant blend α = 0.5 comes within 3% overall, so the residual's value is concentrated where adaptation is hardest, not in the average. Of the six registered criteria concerning the residual stage, three pass, two fail, and one is unevaluated; all are reported.</w:t>
       </w:r>
     </w:p>
     <w:p>
@@ -562,7 +562,7 @@
           <w:color w:val="000000"/>
           <w:sz w:val="22"/>
         </w:rPr>
-        <w:t>Every learned contribution passes a fixed filter stack, in execution order: (i) the residual is bounded; (ii) the blended coefficient is clipped, smoothed, and rate-limited; (iii) expert failure forces primary control; and (iv) non-finite values fall back to the frozen supervised prediction. Because the residual head is zero-initialized, the composite policy reproduces the deployed baseline numerically at initialization, enforced by a unit test comparing full-episode rollouts to tight numerical tolerances. The worst case of the learning components is therefore the baseline policy itself.</w:t>
+        <w:t>Every learned contribution passes a fixed filter stack, in execution order: (i) the residual is bounded; (ii) the blended coefficient is clipped, smoothed, and rate-limited; (iii) expert failure forces primary control; and (iv) non-finite values fall back to the frozen supervised prediction. Because the residual head is zero-initialized, the composite policy reproduces the deployed baseline numerically at initialization, enforced by a unit test comparing full-episode rollouts to tight numerical tolerances. The worst case of the learning components is therefore the baseline policy itself. Figure 2 details the two networks and the two-phase training procedure: the backbone is frozen throughout phase 2, and the residual head is zero-initialized, so the composite policy starts exactly at the supervised baseline.</w:t>
       </w:r>
     </w:p>
     <w:p>
@@ -634,6 +634,73 @@
     </w:p>
     <w:p>
       <w:pPr>
+        <w:keepNext/>
+        <w:spacing w:before="160"/>
+        <w:jc w:val="center"/>
+      </w:pPr>
+      <w:r>
+        <w:drawing>
+          <wp:inline xmlns:a="http://schemas.openxmlformats.org/drawingml/2006/main" xmlns:pic="http://schemas.openxmlformats.org/drawingml/2006/picture">
+            <wp:extent cx="5760720" cy="2736265"/>
+            <wp:docPr id="2" name="Picture 2"/>
+            <wp:cNvGraphicFramePr>
+              <a:graphicFrameLocks noChangeAspect="1"/>
+            </wp:cNvGraphicFramePr>
+            <a:graphic>
+              <a:graphicData uri="http://schemas.openxmlformats.org/drawingml/2006/picture">
+                <pic:pic>
+                  <pic:nvPicPr>
+                    <pic:cNvPr id="0" name="fig_network_training.png"/>
+                    <pic:cNvPicPr/>
+                  </pic:nvPicPr>
+                  <pic:blipFill>
+                    <a:blip r:embed="rId12"/>
+                    <a:stretch>
+                      <a:fillRect/>
+                    </a:stretch>
+                  </pic:blipFill>
+                  <pic:spPr>
+                    <a:xfrm>
+                      <a:off x="0" y="0"/>
+                      <a:ext cx="5760720" cy="2736265"/>
+                    </a:xfrm>
+                    <a:prstGeom prst="rect"/>
+                  </pic:spPr>
+                </pic:pic>
+              </a:graphicData>
+            </a:graphic>
+          </wp:inline>
+        </w:drawing>
+      </w:r>
+    </w:p>
+    <w:p>
+      <w:pPr>
+        <w:spacing w:after="200"/>
+        <w:jc w:val="both"/>
+      </w:pPr>
+      <w:r>
+        <w:rPr>
+          <w:rFonts w:ascii="Times New Roman" w:hAnsi="Times New Roman" w:eastAsia="Times New Roman"/>
+          <w:b/>
+          <w:i w:val="0"/>
+          <w:color w:val="000000"/>
+          <w:sz w:val="18"/>
+        </w:rPr>
+        <w:t xml:space="preserve">Figure 2. </w:t>
+      </w:r>
+      <w:r>
+        <w:rPr>
+          <w:rFonts w:ascii="Times New Roman" w:hAnsi="Times New Roman" w:eastAsia="Times New Roman"/>
+          <w:b w:val="0"/>
+          <w:i w:val="0"/>
+          <w:color w:val="000000"/>
+          <w:sz w:val="18"/>
+        </w:rPr>
+        <w:t>Network architectures and two-phase training. (a) The frozen temporal encoder (14,113 parameters) maps a 16×24 history through a 32-dimensional embedding and one Transformer encoder layer (four-head attention, 128-unit feed-forward) to the supervised authority; the trainable residual head (two linear layers, 2,177 parameters, zero-initialized final layer) revises it by at most 0.1 per step. (b) Phase 1 trains the backbone by imitation of the short-horizon oracle; phase 2 trains only the residual head with TD3, behavior regularization, and a warm-start replay.</w:t>
+      </w:r>
+    </w:p>
+    <w:p>
+      <w:pPr>
         <w:spacing w:line="312" w:lineRule="auto" w:before="280" w:after="120"/>
       </w:pPr>
       <w:r>
@@ -675,7 +742,7 @@
           <w:color w:val="000000"/>
           <w:sz w:val="22"/>
         </w:rPr>
-        <w:t>The supervised policy (PAC-S) is trained by imitation of a short-horizon oracle: for each training state, candidate coefficients from a five-point grid are held for ten steps with the current frozen, and the label minimizes</w:t>
+        <w:t>The supervised PAC policy is trained by imitation of a short-horizon oracle: for each training state, candidate coefficients from a five-point grid are held for ten steps with the current frozen, and the label minimizes</w:t>
       </w:r>
     </w:p>
     <w:p>
@@ -738,7 +805,7 @@
           <w:color w:val="000000"/>
           <w:sz w:val="22"/>
         </w:rPr>
-        <w:t>The residual policy (PAC-RL) appends a two-layer head with 2,177 parameters to each frozen supervisor. The applied coefficient is</w:t>
+        <w:t>The residual policy appends a two-layer head with 2,177 parameters to each frozen supervisor. The applied coefficient is</w:t>
       </w:r>
     </w:p>
     <w:p>
@@ -770,7 +837,7 @@
           <w:color w:val="000000"/>
           <w:sz w:val="22"/>
         </w:rPr>
-        <w:t>where zₜ is the head output and the final layer is zero-initialized, so Δα ≡ 0 before training. Training uses TD3 (twin critics, target smoothing, delayed policy updates) over closed-loop episodes with environment seeds disjoint from all evaluation seeds, warm-started with 2×10⁵ offline transitions collected under PAC-S, with a behavior-regularization term penalizing deviation from the supervisor. The reward combines position and heading error, command magnitude and rate, saturation, deadline flags, and constraint violations; all weights are frozen in a manifest before training. The learner emits Δα only: it cannot command thrusters and cannot alter the MPC schedule or solver budget.</w:t>
+        <w:t>where zₜ is the head output and the final layer is zero-initialized, so Δα ≡ 0 before training. Training uses TD3 (twin critics, target smoothing, delayed policy updates) over closed-loop episodes with environment seeds disjoint from all evaluation seeds, warm-started with 2×10⁵ offline transitions collected under the supervised policy, with a behavior-regularization term penalizing deviation from the supervisor. The reward combines position and heading error, command magnitude and rate, saturation, deadline flags, and constraint violations; all weights are frozen in a manifest before training. The learner emits Δα only: it cannot command thrusters and cannot alter the MPC schedule or solver budget.</w:t>
       </w:r>
     </w:p>
     <w:p>
@@ -847,7 +914,7 @@
           <w:color w:val="000000"/>
           <w:sz w:val="22"/>
         </w:rPr>
-        <w:t>Eight methods are compared: the experts alone (SMC, MPC), a constant blend (Fixed α = 0.5), a non-learning adaptive baseline searching window-level bias schedules by coordinate descent (SSPO), and the two PAC variants (PAC-S, PAC-RL) each instantiated with the same five frozen supervised seeds. Fixed methods contribute one combination each, giving 14 method-seed combinations and 1,680 rollouts (about 3.53 million control steps).</w:t>
+        <w:t>Eight methods are compared: the experts alone (SMC, MPC), a constant blend (Fixed α = 0.5), a non-learning adaptive baseline searching window-level bias schedules by coordinate descent (SSPO, a coordinate-search ablation rather than an external baseline), and the two PAC variants (supervised and residual) each instantiated with the same five frozen supervised seeds. Fixed methods contribute one combination each, giving 14 method-seed combinations and 1,680 rollouts (about 3.53 million control steps).</w:t>
       </w:r>
     </w:p>
     <w:p>
@@ -909,7 +976,7 @@
           <w:color w:val="000000"/>
           <w:sz w:val="22"/>
         </w:rPr>
-        <w:t>Figure 2 shows representative paired episodes—an in-distribution sinusoidal current and the out-of-distribution actuator-degradation episode—as three-dimensional paths, horizontal projections, and vertical error. In-distribution, all learning and blending methods follow the Lissajous reference closely; SMC lags with a visible offset. Under actuator degradation the character changes: the MPC expert alone distorts the horizontal loop and drifts in depth (0.886 m episode RMSE), PAC-S inherits part of that failure (0.206 m), and PAC-RL stays on the reference (0.088 m), slightly better than the never-adapting constant blend (0.124 m).</w:t>
+        <w:t>Figure 3 shows representative paired episodes—an in-distribution sinusoidal current and the out-of-distribution actuator-degradation episode—as three-dimensional paths, horizontal projections, and vertical error. In-distribution, all learning and blending methods follow the Lissajous reference closely; SMC lags with a visible offset. Under actuator degradation the character changes: the MPC expert alone distorts the horizontal loop and drifts in depth (0.886 m episode RMSE), the supervised policy inherits part of that failure (0.206 m), and the residual policy stays on the reference (0.088 m), slightly better than the never-adapting constant blend (0.124 m).</w:t>
       </w:r>
     </w:p>
     <w:p>
@@ -921,8 +988,8 @@
       <w:r>
         <w:drawing>
           <wp:inline xmlns:a="http://schemas.openxmlformats.org/drawingml/2006/main" xmlns:pic="http://schemas.openxmlformats.org/drawingml/2006/picture">
-            <wp:extent cx="5760720" cy="5018096"/>
-            <wp:docPr id="2" name="Picture 2"/>
+            <wp:extent cx="5760720" cy="5799373"/>
+            <wp:docPr id="3" name="Picture 3"/>
             <wp:cNvGraphicFramePr>
               <a:graphicFrameLocks noChangeAspect="1"/>
             </wp:cNvGraphicFramePr>
@@ -934,89 +1001,6 @@
                     <pic:cNvPicPr/>
                   </pic:nvPicPr>
                   <pic:blipFill>
-                    <a:blip r:embed="rId12"/>
-                    <a:stretch>
-                      <a:fillRect/>
-                    </a:stretch>
-                  </pic:blipFill>
-                  <pic:spPr>
-                    <a:xfrm>
-                      <a:off x="0" y="0"/>
-                      <a:ext cx="5760720" cy="5018096"/>
-                    </a:xfrm>
-                    <a:prstGeom prst="rect"/>
-                  </pic:spPr>
-                </pic:pic>
-              </a:graphicData>
-            </a:graphic>
-          </wp:inline>
-        </w:drawing>
-      </w:r>
-    </w:p>
-    <w:p>
-      <w:pPr>
-        <w:spacing w:after="200"/>
-        <w:jc w:val="both"/>
-      </w:pPr>
-      <w:r>
-        <w:rPr>
-          <w:rFonts w:ascii="Times New Roman" w:hAnsi="Times New Roman" w:eastAsia="Times New Roman"/>
-          <w:b/>
-          <w:i w:val="0"/>
-          <w:color w:val="000000"/>
-          <w:sz w:val="18"/>
-        </w:rPr>
-        <w:t xml:space="preserve">Figure 2. </w:t>
-      </w:r>
-      <w:r>
-        <w:rPr>
-          <w:rFonts w:ascii="Times New Roman" w:hAnsi="Times New Roman" w:eastAsia="Times New Roman"/>
-          <w:b w:val="0"/>
-          <w:i w:val="0"/>
-          <w:color w:val="000000"/>
-          <w:sz w:val="18"/>
-        </w:rPr>
-        <w:t>Representative closed-loop trajectories. Columns: in-distribution sinusoidal current and out-of-distribution actuator degradation (the lowest-numbered held-out seed of each block, fixed before inspection); both episodes are shared across methods and regenerated deterministically from the frozen checkpoints. Rows: three-dimensional path, horizontal projection, vertical tracking error (dashed line, zero). The fixed blend is omitted for legibility; its values appear in Table 1.</w:t>
-      </w:r>
-    </w:p>
-    <w:p>
-      <w:pPr>
-        <w:spacing w:line="312" w:lineRule="auto" w:after="120"/>
-        <w:jc w:val="both"/>
-      </w:pPr>
-      <w:r>
-        <w:rPr>
-          <w:rFonts w:ascii="Times New Roman" w:hAnsi="Times New Roman" w:eastAsia="Times New Roman"/>
-          <w:b w:val="0"/>
-          <w:i w:val="0"/>
-          <w:color w:val="000000"/>
-          <w:sz w:val="22"/>
-        </w:rPr>
-        <w:t>Figure 3 resolves the same episodes in time. The position-error row shows the MPC divergence under degradation growing through the episode rather than spiking, consistent with a steadily wrong internal model rather than a transient. Heading error and pitch remain small for PAC-RL in both regimes, while the degraded MPC episode carries visible attitude excursions. Table 1 aggregates the full grid.</w:t>
-      </w:r>
-    </w:p>
-    <w:p>
-      <w:pPr>
-        <w:keepNext/>
-        <w:spacing w:before="160"/>
-        <w:jc w:val="center"/>
-      </w:pPr>
-      <w:r>
-        <w:drawing>
-          <wp:inline xmlns:a="http://schemas.openxmlformats.org/drawingml/2006/main" xmlns:pic="http://schemas.openxmlformats.org/drawingml/2006/picture">
-            <wp:extent cx="5760720" cy="4575448"/>
-            <wp:docPr id="3" name="Picture 3"/>
-            <wp:cNvGraphicFramePr>
-              <a:graphicFrameLocks noChangeAspect="1"/>
-            </wp:cNvGraphicFramePr>
-            <a:graphic>
-              <a:graphicData uri="http://schemas.openxmlformats.org/drawingml/2006/picture">
-                <pic:pic>
-                  <pic:nvPicPr>
-                    <pic:cNvPr id="0" name="fig3_error_attitude.png"/>
-                    <pic:cNvPicPr/>
-                  </pic:nvPicPr>
-                  <pic:blipFill>
                     <a:blip r:embed="rId13"/>
                     <a:stretch>
                       <a:fillRect/>
@@ -1025,7 +1009,7 @@
                   <pic:spPr>
                     <a:xfrm>
                       <a:off x="0" y="0"/>
-                      <a:ext cx="5760720" cy="4575448"/>
+                      <a:ext cx="5760720" cy="5799373"/>
                     </a:xfrm>
                     <a:prstGeom prst="rect"/>
                   </pic:spPr>
@@ -1059,7 +1043,173 @@
           <w:color w:val="000000"/>
           <w:sz w:val="18"/>
         </w:rPr>
-        <w:t>Time-resolved motion errors for the two episodes of Fig. 2. Rows: three-dimensional position error, absolute heading error, pitch angle. The MPC divergence under actuator degradation grows through the episode; PAC-RL remains close to the reference in both regimes. Single episodes; block-level aggregates appear in Table 1 and Fig. 5.</w:t>
+        <w:t>Representative closed-loop trajectories. Columns: in-distribution sinusoidal current and out-of-distribution actuator degradation (the lowest-numbered held-out seed of each block, fixed before inspection); both episodes are shared across methods and regenerated deterministically from the frozen checkpoints. Rows: three-dimensional path, horizontal projection, vertical tracking error (dashed line, zero). The fixed blend is omitted for legibility; its values appear in Table 1.</w:t>
+      </w:r>
+    </w:p>
+    <w:p>
+      <w:pPr>
+        <w:spacing w:line="312" w:lineRule="auto" w:after="120"/>
+        <w:jc w:val="both"/>
+      </w:pPr>
+      <w:r>
+        <w:rPr>
+          <w:rFonts w:ascii="Times New Roman" w:hAnsi="Times New Roman" w:eastAsia="Times New Roman"/>
+          <w:b w:val="0"/>
+          <w:i w:val="0"/>
+          <w:color w:val="000000"/>
+          <w:sz w:val="22"/>
+        </w:rPr>
+        <w:t>Figure 4 resolves the same episodes in time. The position-error row shows the MPC divergence under degradation growing through the episode rather than spiking, consistent with a steadily wrong internal model rather than a transient. Heading error and pitch remain small for residual PAC in both regimes, while the degraded MPC episode carries visible attitude excursions. Table 1 aggregates the full grid.</w:t>
+      </w:r>
+    </w:p>
+    <w:p>
+      <w:pPr>
+        <w:keepNext/>
+        <w:spacing w:before="160"/>
+        <w:jc w:val="center"/>
+      </w:pPr>
+      <w:r>
+        <w:drawing>
+          <wp:inline xmlns:a="http://schemas.openxmlformats.org/drawingml/2006/main" xmlns:pic="http://schemas.openxmlformats.org/drawingml/2006/picture">
+            <wp:extent cx="5760720" cy="4575448"/>
+            <wp:docPr id="4" name="Picture 4"/>
+            <wp:cNvGraphicFramePr>
+              <a:graphicFrameLocks noChangeAspect="1"/>
+            </wp:cNvGraphicFramePr>
+            <a:graphic>
+              <a:graphicData uri="http://schemas.openxmlformats.org/drawingml/2006/picture">
+                <pic:pic>
+                  <pic:nvPicPr>
+                    <pic:cNvPr id="0" name="fig3_error_attitude.png"/>
+                    <pic:cNvPicPr/>
+                  </pic:nvPicPr>
+                  <pic:blipFill>
+                    <a:blip r:embed="rId14"/>
+                    <a:stretch>
+                      <a:fillRect/>
+                    </a:stretch>
+                  </pic:blipFill>
+                  <pic:spPr>
+                    <a:xfrm>
+                      <a:off x="0" y="0"/>
+                      <a:ext cx="5760720" cy="4575448"/>
+                    </a:xfrm>
+                    <a:prstGeom prst="rect"/>
+                  </pic:spPr>
+                </pic:pic>
+              </a:graphicData>
+            </a:graphic>
+          </wp:inline>
+        </w:drawing>
+      </w:r>
+    </w:p>
+    <w:p>
+      <w:pPr>
+        <w:spacing w:after="200"/>
+        <w:jc w:val="both"/>
+      </w:pPr>
+      <w:r>
+        <w:rPr>
+          <w:rFonts w:ascii="Times New Roman" w:hAnsi="Times New Roman" w:eastAsia="Times New Roman"/>
+          <w:b/>
+          <w:i w:val="0"/>
+          <w:color w:val="000000"/>
+          <w:sz w:val="18"/>
+        </w:rPr>
+        <w:t xml:space="preserve">Figure 4. </w:t>
+      </w:r>
+      <w:r>
+        <w:rPr>
+          <w:rFonts w:ascii="Times New Roman" w:hAnsi="Times New Roman" w:eastAsia="Times New Roman"/>
+          <w:b w:val="0"/>
+          <w:i w:val="0"/>
+          <w:color w:val="000000"/>
+          <w:sz w:val="18"/>
+        </w:rPr>
+        <w:t>Time-resolved motion errors for the two episodes of Fig. 2. Rows: three-dimensional position error, absolute heading error, pitch angle. The MPC divergence under actuator degradation grows through the episode; residual PAC remains close to the reference in both regimes. Single episodes; block-level aggregates appear in Table 1 and Fig. 7.</w:t>
+      </w:r>
+    </w:p>
+    <w:p>
+      <w:pPr>
+        <w:spacing w:line="312" w:lineRule="auto" w:after="120"/>
+        <w:jc w:val="both"/>
+      </w:pPr>
+      <w:r>
+        <w:rPr>
+          <w:rFonts w:ascii="Times New Roman" w:hAnsi="Times New Roman" w:eastAsia="Times New Roman"/>
+          <w:b w:val="0"/>
+          <w:i w:val="0"/>
+          <w:color w:val="000000"/>
+          <w:sz w:val="22"/>
+        </w:rPr>
+        <w:t>Residual training is stable across seeds. Figure 5 shows the per-seed mean episode reward during phase 2, collected under exploration noise on the rotating training-family schedule; the trend therefore reflects the changing episode mix rather than greedy-policy performance, and no seed diverges. All five seeds yield policies with consistent closed-loop behavior in the registered evaluation (Fig. 6, Table 1), which is the performance measure of record.</w:t>
+      </w:r>
+    </w:p>
+    <w:p>
+      <w:pPr>
+        <w:keepNext/>
+        <w:spacing w:before="160"/>
+        <w:jc w:val="center"/>
+      </w:pPr>
+      <w:r>
+        <w:drawing>
+          <wp:inline xmlns:a="http://schemas.openxmlformats.org/drawingml/2006/main" xmlns:pic="http://schemas.openxmlformats.org/drawingml/2006/picture">
+            <wp:extent cx="5760720" cy="1925615"/>
+            <wp:docPr id="5" name="Picture 5"/>
+            <wp:cNvGraphicFramePr>
+              <a:graphicFrameLocks noChangeAspect="1"/>
+            </wp:cNvGraphicFramePr>
+            <a:graphic>
+              <a:graphicData uri="http://schemas.openxmlformats.org/drawingml/2006/picture">
+                <pic:pic>
+                  <pic:nvPicPr>
+                    <pic:cNvPr id="0" name="fig_training_curves.png"/>
+                    <pic:cNvPicPr/>
+                  </pic:nvPicPr>
+                  <pic:blipFill>
+                    <a:blip r:embed="rId15"/>
+                    <a:stretch>
+                      <a:fillRect/>
+                    </a:stretch>
+                  </pic:blipFill>
+                  <pic:spPr>
+                    <a:xfrm>
+                      <a:off x="0" y="0"/>
+                      <a:ext cx="5760720" cy="1925615"/>
+                    </a:xfrm>
+                    <a:prstGeom prst="rect"/>
+                  </pic:spPr>
+                </pic:pic>
+              </a:graphicData>
+            </a:graphic>
+          </wp:inline>
+        </w:drawing>
+      </w:r>
+    </w:p>
+    <w:p>
+      <w:pPr>
+        <w:spacing w:after="200"/>
+        <w:jc w:val="both"/>
+      </w:pPr>
+      <w:r>
+        <w:rPr>
+          <w:rFonts w:ascii="Times New Roman" w:hAnsi="Times New Roman" w:eastAsia="Times New Roman"/>
+          <w:b/>
+          <w:i w:val="0"/>
+          <w:color w:val="000000"/>
+          <w:sz w:val="18"/>
+        </w:rPr>
+        <w:t xml:space="preserve">Figure 5. </w:t>
+      </w:r>
+      <w:r>
+        <w:rPr>
+          <w:rFonts w:ascii="Times New Roman" w:hAnsi="Times New Roman" w:eastAsia="Times New Roman"/>
+          <w:b w:val="0"/>
+          <w:i w:val="0"/>
+          <w:color w:val="000000"/>
+          <w:sz w:val="18"/>
+        </w:rPr>
+        <w:t>Residual training across the five model seeds. (a) Episode reward, (b) critic loss, (c) actor loss. Thin lines: per-seed values; bold line and shaded band: five-seed mean $\pm$ 1 sd. All metrics are collected under exploration noise on the rotating training-family schedule, so trends reflect the changing episode mix rather than greedy-policy performance; no seed diverges. Greedy closed-loop performance is the registered evaluation of Fig. 6 and Table 1.</w:t>
       </w:r>
     </w:p>
     <w:p>
@@ -1086,7 +1236,7 @@
           <w:color w:val="000000"/>
           <w:sz w:val="18"/>
         </w:rPr>
-        <w:t>Paired evaluation over 120 episodes per method-seed combination (means over five model seeds for learned methods; ID, in-distribution; OOD, out-of-distribution with respect to disturbance-family sampling). Five-seed dispersion is reported as confidence intervals in Fig. 4a.</w:t>
+        <w:t>Paired evaluation over 120 episodes per method-seed combination (means over five model seeds for learned methods; ID, in-distribution; OOD, out-of-distribution with respect to disturbance-family sampling). Five-seed dispersion is reported as confidence intervals in Fig. 6a.</w:t>
       </w:r>
     </w:p>
     <w:tbl>
@@ -1879,7 +2029,7 @@
                 <w:color w:val="000000"/>
                 <w:sz w:val="17"/>
               </w:rPr>
-              <w:t>PAC-S</w:t>
+              <w:t>Supervised PAC</w:t>
             </w:r>
           </w:p>
         </w:tc>
@@ -2028,7 +2178,7 @@
                 <w:color w:val="000000"/>
                 <w:sz w:val="17"/>
               </w:rPr>
-              <w:t>PAC-RL</w:t>
+              <w:t>Residual PAC</w:t>
             </w:r>
           </w:p>
         </w:tc>
@@ -2193,7 +2343,7 @@
           <w:color w:val="000000"/>
           <w:sz w:val="22"/>
         </w:rPr>
-        <w:t>Across the OOD block, PAC-RL reduces tracking RMSE from 0.161 m (PAC-S) to 0.116 m. The registered model-seed paired effect is −0.0445 m with a 95% t(4) interval of [−0.0737, −0.0154] m (28% relative reduction); the episode-level bootstrap over the 35 OOD episodes is [−0.0759, −0.0167] m, consistent with the seed-level analysis. Maximum error falls from 0.495 m to 0.414 m (five-seed means) and OOD heading error improves by 0.73°.</w:t>
+        <w:t>Across the OOD block, the residual policy reduces tracking RMSE from 0.161 m (supervised) to 0.116 m. The registered model-seed paired effect is −0.0445 m with a 95% t(4) interval of [−0.0737, −0.0154] m (28% relative reduction); the episode-level bootstrap over the 35 OOD episodes is [−0.0759, −0.0167] m, consistent with the seed-level analysis. Maximum error falls from 0.495 m to 0.414 m (five-seed means) and OOD heading error improves by 0.73°.</w:t>
       </w:r>
     </w:p>
     <w:p>
@@ -2209,7 +2359,7 @@
           <w:color w:val="000000"/>
           <w:sz w:val="22"/>
         </w:rPr>
-        <w:t>The sharpest reading of Table 1 is unfavorable to us: a constant α = 0.5 reaches 0.120 m OOD, within 3% of PAC-RL. That comparison was not registered and we make no significance claim; the honest summary is that the residual's overall advantage over never adapting is small, and its value is concentrated where adaptation is hardest (−28% versus the constant blend in the actuator-degradation family, Table 2). The in-distribution effect is +0.0028 m [+0.0009, +0.0047] (+0.4%) and in-distribution heading error rises by 0.32° [+0.29, +0.35] (+4.3%).</w:t>
+        <w:t>The sharpest reading of Table 1 is unfavorable to us: a constant α = 0.5 reaches 0.120 m OOD, within 3% of the residual policy. That comparison was not registered and we make no significance claim; the honest summary is that the residual's overall advantage over never adapting is small, and its value is concentrated where adaptation is hardest (−28% versus the constant blend in the actuator-degradation family, Table 2). The in-distribution effect is +0.0028 m [+0.0009, +0.0047] (+0.4%) and in-distribution heading error rises by 0.32° [+0.29, +0.35] (+4.3%).</w:t>
       </w:r>
     </w:p>
     <w:p>
@@ -2225,7 +2375,7 @@
           <w:color w:val="000000"/>
           <w:sz w:val="22"/>
         </w:rPr>
-        <w:t>The family decomposition in Fig. 4b locates the gain, and the registered paired effects in Fig. 4a quantify it. The SSPO versus PAC-RL contrast is not included in the archived paired-effects summary; it is recomputed from raw episode metrics with the same seed-level procedure: OOD −0.0198 m [−0.0211, −0.0185] in favor of PAC-RL, ID +0.0043 m [+0.0033, +0.0053] in favor of SSPO.</w:t>
+        <w:t>The family decomposition in Fig. 6b locates the gain, and the registered paired effects in Fig. 6a quantify it. The SSPO versus residual PAC contrast is not included in the archived paired-effects summary; it is recomputed from raw episode metrics with the same seed-level procedure: OOD −0.0198 m [−0.0211, −0.0185] in favor of the residual policy, ID +0.0043 m [+0.0033, +0.0053] in favor of SSPO.</w:t>
       </w:r>
     </w:p>
     <w:p>
@@ -2237,8 +2387,8 @@
       <w:r>
         <w:drawing>
           <wp:inline xmlns:a="http://schemas.openxmlformats.org/drawingml/2006/main" xmlns:pic="http://schemas.openxmlformats.org/drawingml/2006/picture">
-            <wp:extent cx="5760720" cy="2835672"/>
-            <wp:docPr id="4" name="Picture 4"/>
+            <wp:extent cx="5760720" cy="2939944"/>
+            <wp:docPr id="6" name="Picture 6"/>
             <wp:cNvGraphicFramePr>
               <a:graphicFrameLocks noChangeAspect="1"/>
             </wp:cNvGraphicFramePr>
@@ -2250,7 +2400,7 @@
                     <pic:cNvPicPr/>
                   </pic:nvPicPr>
                   <pic:blipFill>
-                    <a:blip r:embed="rId14"/>
+                    <a:blip r:embed="rId16"/>
                     <a:stretch>
                       <a:fillRect/>
                     </a:stretch>
@@ -2258,7 +2408,7 @@
                   <pic:spPr>
                     <a:xfrm>
                       <a:off x="0" y="0"/>
-                      <a:ext cx="5760720" cy="2835672"/>
+                      <a:ext cx="5760720" cy="2939944"/>
                     </a:xfrm>
                     <a:prstGeom prst="rect"/>
                   </pic:spPr>
@@ -2282,7 +2432,7 @@
           <w:color w:val="000000"/>
           <w:sz w:val="18"/>
         </w:rPr>
-        <w:t xml:space="preserve">Figure 4. </w:t>
+        <w:t xml:space="preserve">Figure 6. </w:t>
       </w:r>
       <w:r>
         <w:rPr>
@@ -2292,7 +2442,7 @@
           <w:color w:val="000000"/>
           <w:sz w:val="18"/>
         </w:rPr>
-        <w:t>Registered paired effects and family decomposition. (a) RMSE paired effects with model-seed t(4) 95% intervals by block (OOD, ID); filled markers denote intervals excluding zero; the SSPO versus PAC-S contrast is as archived; the SSPO contrast is recomputed from raw episode metrics. (b) OOD RMSE by disturbance family and method. Gains concentrate in the actuator-degradation family; in the mild stochastic and estimation-delay families the supervised policy and SSPO remain marginally better. The panel does not support uniform superiority.</w:t>
+        <w:t>Registered paired effects and family decomposition. (a) RMSE paired effects with model-seed t(4) 95% intervals by block (OOD, ID); filled markers denote intervals excluding zero; the SSPO versus supervised contrast is as archived; the SSPO contrast is recomputed from raw episode metrics. (b) OOD RMSE by disturbance family and method. Gains concentrate in the actuator-degradation family; in the mild stochastic and estimation-delay families the supervised policy and SSPO remain marginally better. The panel does not support uniform superiority.</w:t>
       </w:r>
     </w:p>
     <w:p>
@@ -2424,7 +2574,7 @@
                 <w:color w:val="000000"/>
                 <w:sz w:val="17"/>
               </w:rPr>
-              <w:t>vs PAC-S</w:t>
+              <w:t>vs supervised PAC</w:t>
             </w:r>
           </w:p>
         </w:tc>
@@ -2791,7 +2941,7 @@
                 <w:color w:val="000000"/>
                 <w:sz w:val="17"/>
               </w:rPr>
-              <w:t>PAC-S</w:t>
+              <w:t>Supervised PAC</w:t>
             </w:r>
           </w:p>
         </w:tc>
@@ -2877,7 +3027,7 @@
                 <w:color w:val="000000"/>
                 <w:sz w:val="17"/>
               </w:rPr>
-              <w:t>PAC-RL</w:t>
+              <w:t>Residual PAC</w:t>
             </w:r>
           </w:p>
         </w:tc>
@@ -2979,7 +3129,23 @@
           <w:color w:val="000000"/>
           <w:sz w:val="22"/>
         </w:rPr>
-        <w:t>The mechanism is visible in Fig. 5b. Within seconds of degraded-thruster onset, the supervised policy drives α above 0.9 and oscillates there for much of the episode (31.2% of steps above 0.9; standard deviation 0.331); the residual policy never exceeds 0.69 and holds [0.4, 0.6] on 97.0% of steps. The residual has not learned a new schedule—it has learned to veto the supervisor's excursions. We read this as conservatism under distribution shift, a single-family observation we do not extrapolate.</w:t>
+        <w:t>The mechanism is visible in Fig. 7b. Within seconds of degraded-thruster onset, the supervised policy drives α above 0.9 and oscillates there for much of the episode (31.2% of steps above 0.9; standard deviation 0.331); the residual policy never exceeds 0.69 and holds [0.4, 0.6] on 97.0% of steps. The residual has not learned a new schedule—it has learned to veto the supervisor's excursions. We read this as conservatism under distribution shift, a single-family observation we do not extrapolate.</w:t>
+      </w:r>
+    </w:p>
+    <w:p>
+      <w:pPr>
+        <w:spacing w:line="312" w:lineRule="auto" w:after="120"/>
+        <w:jc w:val="both"/>
+      </w:pPr>
+      <w:r>
+        <w:rPr>
+          <w:rFonts w:ascii="Times New Roman" w:hAnsi="Times New Roman" w:eastAsia="Times New Roman"/>
+          <w:b w:val="0"/>
+          <w:i w:val="0"/>
+          <w:color w:val="000000"/>
+          <w:sz w:val="22"/>
+        </w:rPr>
+        <w:t>The stabilization generalizes beyond the single episode: across all 35 OOD episodes and five seeds (175 episodes per method), the per-episode mean authority is 0.82 ± 0.14 for the supervised policy (10th–90th percentile 0.62–0.93) and 0.54 ± 0.03 for the residual policy, with every residual episode inside [0.48, 0.62] (Fig. 7c).</w:t>
       </w:r>
     </w:p>
     <w:p>
@@ -2991,8 +3157,8 @@
       <w:r>
         <w:drawing>
           <wp:inline xmlns:a="http://schemas.openxmlformats.org/drawingml/2006/main" xmlns:pic="http://schemas.openxmlformats.org/drawingml/2006/picture">
-            <wp:extent cx="5760720" cy="3144438"/>
-            <wp:docPr id="5" name="Picture 5"/>
+            <wp:extent cx="5760720" cy="3974557"/>
+            <wp:docPr id="7" name="Picture 7"/>
             <wp:cNvGraphicFramePr>
               <a:graphicFrameLocks noChangeAspect="1"/>
             </wp:cNvGraphicFramePr>
@@ -3004,7 +3170,7 @@
                     <pic:cNvPicPr/>
                   </pic:nvPicPr>
                   <pic:blipFill>
-                    <a:blip r:embed="rId15"/>
+                    <a:blip r:embed="rId17"/>
                     <a:stretch>
                       <a:fillRect/>
                     </a:stretch>
@@ -3012,7 +3178,7 @@
                   <pic:spPr>
                     <a:xfrm>
                       <a:off x="0" y="0"/>
-                      <a:ext cx="5760720" cy="3144438"/>
+                      <a:ext cx="5760720" cy="3974557"/>
                     </a:xfrm>
                     <a:prstGeom prst="rect"/>
                   </pic:spPr>
@@ -3036,7 +3202,7 @@
           <w:color w:val="000000"/>
           <w:sz w:val="18"/>
         </w:rPr>
-        <w:t xml:space="preserve">Figure 5. </w:t>
+        <w:t xml:space="preserve">Figure 7. </w:t>
       </w:r>
       <w:r>
         <w:rPr>
@@ -3046,7 +3212,7 @@
           <w:color w:val="000000"/>
           <w:sz w:val="18"/>
         </w:rPr>
-        <w:t>Actuator-degradation episode (held-out seed 43000, fixed before inspection; family means superposed as text). (a) Position error. (b) Authority coefficient. Family-mean coefficients: 0.63 (PAC-S) versus 0.50 (PAC-RL).</w:t>
+        <w:t>Actuator-degradation episode (held-out seed 43000, fixed before inspection; family means superposed as text). (a) Position error. (b) Authority coefficient in the representative episode. (c) Box plots of per-episode mean authority over all 35 OOD episodes and five seeds (175 points per method; boxes: IQR, whiskers: range, line: median). Family-mean coefficients: 0.63 (supervised) versus 0.50 (residual).</w:t>
       </w:r>
     </w:p>
     <w:p>
@@ -3061,7 +3227,7 @@
           <w:color w:val="000000"/>
           <w:sz w:val="23"/>
         </w:rPr>
-        <w:t>6.4  The price of the gain</w:t>
+        <w:t>6.4  Control quality: the gain is not purchased with actuator abuse</w:t>
       </w:r>
     </w:p>
     <w:p>
@@ -3077,7 +3243,105 @@
           <w:color w:val="000000"/>
           <w:sz w:val="22"/>
         </w:rPr>
-        <w:t>Two costs accompany the OOD gain. In-distribution position and heading error increase as quantified above. And the solver deadline-miss fraction—steps on which the harness MPC instance exceeds the 10 ms period, measured identically for every method—rises from a common 0.69 baseline to 0.80 under PAC-RL (+0.107 [+0.094, +0.120] OOD; +0.028 [+0.010, +0.047] ID). The constant blend leaves the metric unchanged, so the coefficient value itself is not the cause; a candidate explanation is trajectory-dependent solver conditioning, flagged as a hypothesis rather than a conclusion. Deployed safeguards are unaffected: fallback to the previous plan triggers on 0.3–0.5% of steps for all methods, success at the one-metre threshold is unchanged (0.988 ID / 0.943 OOD), and OOD maximum error improves.</w:t>
+        <w:t>On the OOD block the residual policy attains the lowest saturation-step fraction of all six methods (0.126, versus 0.134 for the fixed blend and 0.168 for the supervised policy), the lowest applied control cost (31.9 versus 33.7), and a rate-limit activation of 0.039 below both experts. The paired effect on control cost is −1.78 [−2.31, −1.26] OOD and −0.52 [−0.56, −0.48] ID: the residual policy is in fact cheaper to run than its supervisor while tracking better OOD. This substantiates the registered criterion that gains must not be purchased with heading, saturation, or constraint degradation (Fig. 8).</w:t>
+      </w:r>
+    </w:p>
+    <w:p>
+      <w:pPr>
+        <w:keepNext/>
+        <w:spacing w:before="160"/>
+        <w:jc w:val="center"/>
+      </w:pPr>
+      <w:r>
+        <w:drawing>
+          <wp:inline xmlns:a="http://schemas.openxmlformats.org/drawingml/2006/main" xmlns:pic="http://schemas.openxmlformats.org/drawingml/2006/picture">
+            <wp:extent cx="5760720" cy="2034380"/>
+            <wp:docPr id="8" name="Picture 8"/>
+            <wp:cNvGraphicFramePr>
+              <a:graphicFrameLocks noChangeAspect="1"/>
+            </wp:cNvGraphicFramePr>
+            <a:graphic>
+              <a:graphicData uri="http://schemas.openxmlformats.org/drawingml/2006/picture">
+                <pic:pic>
+                  <pic:nvPicPr>
+                    <pic:cNvPr id="0" name="fig_control_quality.png"/>
+                    <pic:cNvPicPr/>
+                  </pic:nvPicPr>
+                  <pic:blipFill>
+                    <a:blip r:embed="rId18"/>
+                    <a:stretch>
+                      <a:fillRect/>
+                    </a:stretch>
+                  </pic:blipFill>
+                  <pic:spPr>
+                    <a:xfrm>
+                      <a:off x="0" y="0"/>
+                      <a:ext cx="5760720" cy="2034380"/>
+                    </a:xfrm>
+                    <a:prstGeom prst="rect"/>
+                  </pic:spPr>
+                </pic:pic>
+              </a:graphicData>
+            </a:graphic>
+          </wp:inline>
+        </w:drawing>
+      </w:r>
+    </w:p>
+    <w:p>
+      <w:pPr>
+        <w:spacing w:after="200"/>
+        <w:jc w:val="both"/>
+      </w:pPr>
+      <w:r>
+        <w:rPr>
+          <w:rFonts w:ascii="Times New Roman" w:hAnsi="Times New Roman" w:eastAsia="Times New Roman"/>
+          <w:b/>
+          <w:i w:val="0"/>
+          <w:color w:val="000000"/>
+          <w:sz w:val="18"/>
+        </w:rPr>
+        <w:t xml:space="preserve">Figure 8. </w:t>
+      </w:r>
+      <w:r>
+        <w:rPr>
+          <w:rFonts w:ascii="Times New Roman" w:hAnsi="Times New Roman" w:eastAsia="Times New Roman"/>
+          <w:b w:val="0"/>
+          <w:i w:val="0"/>
+          <w:color w:val="000000"/>
+          <w:sz w:val="18"/>
+        </w:rPr>
+        <w:t>Control quality by method and block (bars: five-seed means $\pm$ sd). (a) Applied control cost. (b) Saturation-step fraction. (c) Rate-limit activation. The residual policy attains the lowest OOD saturation and control cost of all methods.</w:t>
+      </w:r>
+    </w:p>
+    <w:p>
+      <w:pPr>
+        <w:spacing w:line="312" w:lineRule="auto" w:before="200" w:after="80"/>
+      </w:pPr>
+      <w:r>
+        <w:rPr>
+          <w:rFonts w:ascii="Times New Roman" w:hAnsi="Times New Roman" w:eastAsia="Times New Roman"/>
+          <w:b/>
+          <w:i w:val="0"/>
+          <w:color w:val="000000"/>
+          <w:sz w:val="23"/>
+        </w:rPr>
+        <w:t>6.5  The price of the gain</w:t>
+      </w:r>
+    </w:p>
+    <w:p>
+      <w:pPr>
+        <w:spacing w:line="312" w:lineRule="auto" w:after="120"/>
+        <w:jc w:val="both"/>
+      </w:pPr>
+      <w:r>
+        <w:rPr>
+          <w:rFonts w:ascii="Times New Roman" w:hAnsi="Times New Roman" w:eastAsia="Times New Roman"/>
+          <w:b w:val="0"/>
+          <w:i w:val="0"/>
+          <w:color w:val="000000"/>
+          <w:sz w:val="22"/>
+        </w:rPr>
+        <w:t>Two costs accompany the OOD gain. In-distribution position and heading error increase as quantified above. And the solver deadline-miss fraction—steps on which the harness MPC instance exceeds the 10 ms period, measured identically for every method—rises from a common 0.69 baseline to 0.80 under the residual policy (+0.107 [+0.094, +0.120] OOD; +0.028 [+0.010, +0.047] ID). The constant blend leaves the metric unchanged, so the coefficient value itself is not the cause; a candidate explanation is trajectory-dependent solver conditioning, flagged as a hypothesis rather than a conclusion. Deployed safeguards are unaffected: fallback to the previous plan triggers on 0.3–0.5% of steps for all methods, success at the one-metre threshold is unchanged (0.988 ID / 0.943 OOD), and OOD maximum error improves.</w:t>
       </w:r>
     </w:p>
     <w:p>
@@ -3090,7 +3354,7 @@
         <w:drawing>
           <wp:inline xmlns:a="http://schemas.openxmlformats.org/drawingml/2006/main" xmlns:pic="http://schemas.openxmlformats.org/drawingml/2006/picture">
             <wp:extent cx="5760720" cy="2206662"/>
-            <wp:docPr id="6" name="Picture 6"/>
+            <wp:docPr id="9" name="Picture 9"/>
             <wp:cNvGraphicFramePr>
               <a:graphicFrameLocks noChangeAspect="1"/>
             </wp:cNvGraphicFramePr>
@@ -3102,7 +3366,7 @@
                     <pic:cNvPicPr/>
                   </pic:nvPicPr>
                   <pic:blipFill>
-                    <a:blip r:embed="rId16"/>
+                    <a:blip r:embed="rId19"/>
                     <a:stretch>
                       <a:fillRect/>
                     </a:stretch>
@@ -3134,7 +3398,7 @@
           <w:color w:val="000000"/>
           <w:sz w:val="18"/>
         </w:rPr>
-        <w:t xml:space="preserve">Figure 6. </w:t>
+        <w:t xml:space="preserve">Figure 9. </w:t>
       </w:r>
       <w:r>
         <w:rPr>
@@ -3146,6 +3410,383 @@
         </w:rPr>
         <w:t>Cost accounting. OOD RMSE versus solver deadline-miss fraction for every method-seed combination; the metric counts steps on which the shared-harness MPC instance exceeds the 10 ms period, collected identically for all methods. Shaded band: common baseline level (0.69; SMC / MPC / Fixed α / SSPO).</w:t>
       </w:r>
+    </w:p>
+    <w:p>
+      <w:pPr>
+        <w:keepNext/>
+        <w:spacing w:before="160"/>
+        <w:jc w:val="both"/>
+      </w:pPr>
+      <w:r>
+        <w:rPr>
+          <w:rFonts w:ascii="Times New Roman" w:hAnsi="Times New Roman" w:eastAsia="Times New Roman"/>
+          <w:b/>
+          <w:i w:val="0"/>
+          <w:color w:val="000000"/>
+          <w:sz w:val="18"/>
+        </w:rPr>
+        <w:t xml:space="preserve">Table 3. </w:t>
+      </w:r>
+      <w:r>
+        <w:rPr>
+          <w:rFonts w:ascii="Times New Roman" w:hAnsi="Times New Roman" w:eastAsia="Times New Roman"/>
+          <w:b/>
+          <w:i w:val="0"/>
+          <w:color w:val="000000"/>
+          <w:sz w:val="18"/>
+        </w:rPr>
+        <w:t>Registered paired effects of the residual policy versus the supervised baseline across all reported metrics (model-seed t(4) 95% intervals). The SSPO contrast, recomputed from raw episode metrics, is RMSE OOD −0.0198 [−0.0211, −0.0185] in favor of the residual policy and ID +0.0043 [+0.0033, +0.0053] in favor of SSPO.</w:t>
+      </w:r>
+    </w:p>
+    <w:tbl>
+      <w:tblPr>
+        <w:tblStyle w:val="TableGrid"/>
+        <w:tblW w:type="auto" w:w="0"/>
+        <w:jc w:val="center"/>
+        <w:tblLayout w:type="fixed"/>
+        <w:tblLook w:firstColumn="1" w:firstRow="1" w:lastColumn="0" w:lastRow="0" w:noHBand="0" w:noVBand="1" w:val="04A0"/>
+      </w:tblPr>
+      <w:tblGrid>
+        <w:gridCol w:w="3120"/>
+        <w:gridCol w:w="3120"/>
+        <w:gridCol w:w="3120"/>
+      </w:tblGrid>
+      <w:tr>
+        <w:trPr>
+          <w:tblHeader/>
+        </w:trPr>
+        <w:tc>
+          <w:tcPr>
+            <w:tcW w:type="dxa" w:w="3168"/>
+            <w:shd w:val="clear" w:fill="F2F2F2"/>
+          </w:tcPr>
+          <w:p>
+            <w:pPr>
+              <w:spacing w:line="276" w:lineRule="auto"/>
+              <w:jc w:val="center"/>
+            </w:pPr>
+            <w:r>
+              <w:rPr>
+                <w:rFonts w:ascii="Times New Roman" w:hAnsi="Times New Roman" w:eastAsia="Times New Roman"/>
+                <w:b/>
+                <w:i w:val="0"/>
+                <w:color w:val="000000"/>
+                <w:sz w:val="17"/>
+              </w:rPr>
+              <w:t>Metric</w:t>
+            </w:r>
+          </w:p>
+        </w:tc>
+        <w:tc>
+          <w:tcPr>
+            <w:tcW w:type="dxa" w:w="3168"/>
+            <w:shd w:val="clear" w:fill="F2F2F2"/>
+          </w:tcPr>
+          <w:p>
+            <w:pPr>
+              <w:spacing w:line="276" w:lineRule="auto"/>
+              <w:jc w:val="center"/>
+            </w:pPr>
+            <w:r>
+              <w:rPr>
+                <w:rFonts w:ascii="Times New Roman" w:hAnsi="Times New Roman" w:eastAsia="Times New Roman"/>
+                <w:b/>
+                <w:i w:val="0"/>
+                <w:color w:val="000000"/>
+                <w:sz w:val="17"/>
+              </w:rPr>
+              <w:t>ID effect [95% CI]</w:t>
+            </w:r>
+          </w:p>
+        </w:tc>
+        <w:tc>
+          <w:tcPr>
+            <w:tcW w:type="dxa" w:w="3168"/>
+            <w:shd w:val="clear" w:fill="F2F2F2"/>
+          </w:tcPr>
+          <w:p>
+            <w:pPr>
+              <w:spacing w:line="276" w:lineRule="auto"/>
+              <w:jc w:val="center"/>
+            </w:pPr>
+            <w:r>
+              <w:rPr>
+                <w:rFonts w:ascii="Times New Roman" w:hAnsi="Times New Roman" w:eastAsia="Times New Roman"/>
+                <w:b/>
+                <w:i w:val="0"/>
+                <w:color w:val="000000"/>
+                <w:sz w:val="17"/>
+              </w:rPr>
+              <w:t>OOD effect [95% CI]</w:t>
+            </w:r>
+          </w:p>
+        </w:tc>
+      </w:tr>
+      <w:tr>
+        <w:tc>
+          <w:tcPr>
+            <w:tcW w:type="dxa" w:w="3168"/>
+          </w:tcPr>
+          <w:p>
+            <w:pPr>
+              <w:spacing w:line="276" w:lineRule="auto"/>
+              <w:jc w:val="left"/>
+            </w:pPr>
+            <w:r>
+              <w:rPr>
+                <w:rFonts w:ascii="Times New Roman" w:hAnsi="Times New Roman" w:eastAsia="Times New Roman"/>
+                <w:b w:val="0"/>
+                <w:i w:val="0"/>
+                <w:color w:val="000000"/>
+                <w:sz w:val="17"/>
+              </w:rPr>
+              <w:t>RMSE (m)</w:t>
+            </w:r>
+          </w:p>
+        </w:tc>
+        <w:tc>
+          <w:tcPr>
+            <w:tcW w:type="dxa" w:w="3168"/>
+          </w:tcPr>
+          <w:p>
+            <w:pPr>
+              <w:spacing w:line="276" w:lineRule="auto"/>
+              <w:jc w:val="center"/>
+            </w:pPr>
+            <w:r>
+              <w:rPr>
+                <w:rFonts w:ascii="Times New Roman" w:hAnsi="Times New Roman" w:eastAsia="Times New Roman"/>
+                <w:b w:val="0"/>
+                <w:i w:val="0"/>
+                <w:color w:val="000000"/>
+                <w:sz w:val="17"/>
+              </w:rPr>
+              <w:t>+0.0028 [+0.0009, +0.0047]</w:t>
+            </w:r>
+          </w:p>
+        </w:tc>
+        <w:tc>
+          <w:tcPr>
+            <w:tcW w:type="dxa" w:w="3168"/>
+          </w:tcPr>
+          <w:p>
+            <w:pPr>
+              <w:spacing w:line="276" w:lineRule="auto"/>
+              <w:jc w:val="center"/>
+            </w:pPr>
+            <w:r>
+              <w:rPr>
+                <w:rFonts w:ascii="Times New Roman" w:hAnsi="Times New Roman" w:eastAsia="Times New Roman"/>
+                <w:b w:val="0"/>
+                <w:i w:val="0"/>
+                <w:color w:val="000000"/>
+                <w:sz w:val="17"/>
+              </w:rPr>
+              <w:t>−0.0445 [−0.0737, −0.0154]</w:t>
+            </w:r>
+          </w:p>
+        </w:tc>
+      </w:tr>
+      <w:tr>
+        <w:tc>
+          <w:tcPr>
+            <w:tcW w:type="dxa" w:w="3168"/>
+          </w:tcPr>
+          <w:p>
+            <w:pPr>
+              <w:spacing w:line="276" w:lineRule="auto"/>
+              <w:jc w:val="left"/>
+            </w:pPr>
+            <w:r>
+              <w:rPr>
+                <w:rFonts w:ascii="Times New Roman" w:hAnsi="Times New Roman" w:eastAsia="Times New Roman"/>
+                <w:b w:val="0"/>
+                <w:i w:val="0"/>
+                <w:color w:val="000000"/>
+                <w:sz w:val="17"/>
+              </w:rPr>
+              <w:t>Heading error (deg)</w:t>
+            </w:r>
+          </w:p>
+        </w:tc>
+        <w:tc>
+          <w:tcPr>
+            <w:tcW w:type="dxa" w:w="3168"/>
+          </w:tcPr>
+          <w:p>
+            <w:pPr>
+              <w:spacing w:line="276" w:lineRule="auto"/>
+              <w:jc w:val="center"/>
+            </w:pPr>
+            <w:r>
+              <w:rPr>
+                <w:rFonts w:ascii="Times New Roman" w:hAnsi="Times New Roman" w:eastAsia="Times New Roman"/>
+                <w:b w:val="0"/>
+                <w:i w:val="0"/>
+                <w:color w:val="000000"/>
+                <w:sz w:val="17"/>
+              </w:rPr>
+              <w:t>+0.32 [+0.29, +0.35]</w:t>
+            </w:r>
+          </w:p>
+        </w:tc>
+        <w:tc>
+          <w:tcPr>
+            <w:tcW w:type="dxa" w:w="3168"/>
+          </w:tcPr>
+          <w:p>
+            <w:pPr>
+              <w:spacing w:line="276" w:lineRule="auto"/>
+              <w:jc w:val="center"/>
+            </w:pPr>
+            <w:r>
+              <w:rPr>
+                <w:rFonts w:ascii="Times New Roman" w:hAnsi="Times New Roman" w:eastAsia="Times New Roman"/>
+                <w:b w:val="0"/>
+                <w:i w:val="0"/>
+                <w:color w:val="000000"/>
+                <w:sz w:val="17"/>
+              </w:rPr>
+              <w:t>−0.73 [−1.41, −0.06]</w:t>
+            </w:r>
+          </w:p>
+        </w:tc>
+      </w:tr>
+      <w:tr>
+        <w:tc>
+          <w:tcPr>
+            <w:tcW w:type="dxa" w:w="3168"/>
+          </w:tcPr>
+          <w:p>
+            <w:pPr>
+              <w:spacing w:line="276" w:lineRule="auto"/>
+              <w:jc w:val="left"/>
+            </w:pPr>
+            <w:r>
+              <w:rPr>
+                <w:rFonts w:ascii="Times New Roman" w:hAnsi="Times New Roman" w:eastAsia="Times New Roman"/>
+                <w:b w:val="0"/>
+                <w:i w:val="0"/>
+                <w:color w:val="000000"/>
+                <w:sz w:val="17"/>
+              </w:rPr>
+              <w:t>Applied control cost</w:t>
+            </w:r>
+          </w:p>
+        </w:tc>
+        <w:tc>
+          <w:tcPr>
+            <w:tcW w:type="dxa" w:w="3168"/>
+          </w:tcPr>
+          <w:p>
+            <w:pPr>
+              <w:spacing w:line="276" w:lineRule="auto"/>
+              <w:jc w:val="center"/>
+            </w:pPr>
+            <w:r>
+              <w:rPr>
+                <w:rFonts w:ascii="Times New Roman" w:hAnsi="Times New Roman" w:eastAsia="Times New Roman"/>
+                <w:b w:val="0"/>
+                <w:i w:val="0"/>
+                <w:color w:val="000000"/>
+                <w:sz w:val="17"/>
+              </w:rPr>
+              <w:t>−0.52 [−0.56, −0.48]</w:t>
+            </w:r>
+          </w:p>
+        </w:tc>
+        <w:tc>
+          <w:tcPr>
+            <w:tcW w:type="dxa" w:w="3168"/>
+          </w:tcPr>
+          <w:p>
+            <w:pPr>
+              <w:spacing w:line="276" w:lineRule="auto"/>
+              <w:jc w:val="center"/>
+            </w:pPr>
+            <w:r>
+              <w:rPr>
+                <w:rFonts w:ascii="Times New Roman" w:hAnsi="Times New Roman" w:eastAsia="Times New Roman"/>
+                <w:b w:val="0"/>
+                <w:i w:val="0"/>
+                <w:color w:val="000000"/>
+                <w:sz w:val="17"/>
+              </w:rPr>
+              <w:t>−1.78 [−2.31, −1.26]</w:t>
+            </w:r>
+          </w:p>
+        </w:tc>
+      </w:tr>
+      <w:tr>
+        <w:tc>
+          <w:tcPr>
+            <w:tcW w:type="dxa" w:w="3168"/>
+          </w:tcPr>
+          <w:p>
+            <w:pPr>
+              <w:spacing w:line="276" w:lineRule="auto"/>
+              <w:jc w:val="left"/>
+            </w:pPr>
+            <w:r>
+              <w:rPr>
+                <w:rFonts w:ascii="Times New Roman" w:hAnsi="Times New Roman" w:eastAsia="Times New Roman"/>
+                <w:b w:val="0"/>
+                <w:i w:val="0"/>
+                <w:color w:val="000000"/>
+                <w:sz w:val="17"/>
+              </w:rPr>
+              <w:t>Deadline-miss fraction</w:t>
+            </w:r>
+          </w:p>
+        </w:tc>
+        <w:tc>
+          <w:tcPr>
+            <w:tcW w:type="dxa" w:w="3168"/>
+          </w:tcPr>
+          <w:p>
+            <w:pPr>
+              <w:spacing w:line="276" w:lineRule="auto"/>
+              <w:jc w:val="center"/>
+            </w:pPr>
+            <w:r>
+              <w:rPr>
+                <w:rFonts w:ascii="Times New Roman" w:hAnsi="Times New Roman" w:eastAsia="Times New Roman"/>
+                <w:b w:val="0"/>
+                <w:i w:val="0"/>
+                <w:color w:val="000000"/>
+                <w:sz w:val="17"/>
+              </w:rPr>
+              <w:t>+0.028 [+0.010, +0.047]</w:t>
+            </w:r>
+          </w:p>
+        </w:tc>
+        <w:tc>
+          <w:tcPr>
+            <w:tcW w:type="dxa" w:w="3168"/>
+          </w:tcPr>
+          <w:p>
+            <w:pPr>
+              <w:spacing w:line="276" w:lineRule="auto"/>
+              <w:jc w:val="center"/>
+            </w:pPr>
+            <w:r>
+              <w:rPr>
+                <w:rFonts w:ascii="Times New Roman" w:hAnsi="Times New Roman" w:eastAsia="Times New Roman"/>
+                <w:b w:val="0"/>
+                <w:i w:val="0"/>
+                <w:color w:val="000000"/>
+                <w:sz w:val="17"/>
+              </w:rPr>
+              <w:t>+0.107 [+0.094, +0.120]</w:t>
+            </w:r>
+          </w:p>
+        </w:tc>
+      </w:tr>
+    </w:tbl>
+    <w:p>
+      <w:pPr>
+        <w:spacing w:after="40"/>
+      </w:pPr>
     </w:p>
     <w:p>
       <w:pPr>
@@ -3223,7 +3864,7 @@
           <w:color w:val="000000"/>
           <w:sz w:val="22"/>
         </w:rPr>
-        <w:t>These boundaries define the next experiments: a second residual round with the final encoder block unfrozen under a registered rule targeting the in-distribution effect; isolation of the deadline mechanism; and the hardware protocol of Section 8.</w:t>
+        <w:t>These boundaries define the registered next experiments. First, a direct-RL arm—an end-to-end TD3 policy emitting thruster commands on the same grid—completes the comparison hierarchy that residual-RL studies expect. Second, a constant-authority sweep over α ∈ {0, 0.25, 0.5, 0.75, 1} exposes the trust landscape that the policy navigates. Both require new registered runs. Third, a second residual round with the final encoder block unfrozen targets the in-distribution effect. Fourth, isolation of the deadline mechanism. Fifth, the hardware protocol of Section 8, whose first gate is deployment latency.</w:t>
       </w:r>
     </w:p>
     <w:p>
@@ -3254,7 +3895,7 @@
           <w:color w:val="000000"/>
           <w:sz w:val="22"/>
         </w:rPr>
-        <w:t>The paper is not submission-ready without physical experiments. The planned study deploys the same SMC, MPC expert, PAC-S, and PAC-RL checkpoints on the 10-kg six-thruster vehicle. The protocol includes at least ten independent trials per method and disturbance condition, randomized controller order, a fixed battery-voltage acceptance window, and identical trajectory and actuator limits. Disturbances progress from quiescent water to steady cross-flow, a repeatable step-like disturbance from a tethered pull or calibrated flow source, and—specific to this paper's claims—an injected actuator-degradation condition realized by a validated first-order command lag plus noise on a subset of thrusters.</w:t>
+        <w:t>The paper is not submission-ready without physical experiments. The planned study deploys the same SMC, MPC expert, supervised PAC, and residual PAC checkpoints on the 10-kg six-thruster vehicle. The protocol includes at least ten independent trials per method and disturbance condition, randomized controller order, a fixed battery-voltage acceptance window, and identical trajectory and actuator limits. Disturbances progress from quiescent water to steady cross-flow, a repeatable step-like disturbance from a tethered pull or calibrated flow source, and—specific to this paper's claims—an injected actuator-degradation condition realized by a validated first-order command lag plus noise on a subset of thrusters.</w:t>
       </w:r>
     </w:p>
     <w:p>

</xml_diff>